<commit_message>
update blog by @qiucaoBot
</commit_message>
<xml_diff>
--- a/post/72-微软已发布playwright-mcp/pr-mcp.docx
+++ b/post/72-微软已发布playwright-mcp/pr-mcp.docx
@@ -460,7 +460,7 @@
       </w:r>
     </w:p>
     <w:bookmarkEnd w:id="27"/>
-    <w:bookmarkStart w:id="47" w:name="playwright-mcp-部署"/>
+    <w:bookmarkStart w:id="64" w:name="playwright-mcp-部署"/>
     <w:p>
       <w:pPr>
         <w:pStyle w:val="Heading1"/>
@@ -980,7 +980,3048 @@
         <w:t xml:space="preserve">基于MCP-Server，相信还有更多、更丰富的实践可以帮助到我们！</w:t>
       </w:r>
     </w:p>
+    <w:p>
+      <w:r>
+        <w:pict>
+          <v:rect style="width:0;height:1.5pt" o:hralign="center" o:hrstd="t" o:hr="t"/>
+        </w:pict>
+      </w:r>
+    </w:p>
+    <w:p>
+      <w:pPr>
+        <w:pStyle w:val="FirstParagraph"/>
+      </w:pPr>
+      <w:r>
+        <w:rPr>
+          <w:rFonts w:hint="eastAsia"/>
+        </w:rPr>
+        <w:t xml:space="preserve">上一篇文章中，我们介绍了通过vscode</w:t>
+      </w:r>
+      <w:r>
+        <w:t xml:space="preserve"> insiders </w:t>
+      </w:r>
+      <w:r>
+        <w:rPr>
+          <w:rFonts w:hint="eastAsia"/>
+        </w:rPr>
+        <w:t xml:space="preserve">集成微软官方的playwright</w:t>
+      </w:r>
+      <w:r>
+        <w:t xml:space="preserve"> </w:t>
+      </w:r>
+      <w:r>
+        <w:rPr>
+          <w:rFonts w:hint="eastAsia"/>
+        </w:rPr>
+        <w:t xml:space="preserve">mcp并执行测试的一个基本效果。</w:t>
+      </w:r>
+    </w:p>
+    <w:p>
+      <w:pPr>
+        <w:pStyle w:val="BodyText"/>
+      </w:pPr>
+      <w:r>
+        <w:rPr>
+          <w:rFonts w:hint="eastAsia"/>
+        </w:rPr>
+        <w:t xml:space="preserve">有小伙伴提问是否能在</w:t>
+      </w:r>
+      <w:r>
+        <w:t xml:space="preserve"> </w:t>
+      </w:r>
+      <w:r>
+        <w:rPr>
+          <w:rStyle w:val="VerbatimChar"/>
+        </w:rPr>
+        <w:t xml:space="preserve">Cursor</w:t>
+      </w:r>
+      <w:r>
+        <w:t xml:space="preserve"> </w:t>
+      </w:r>
+      <w:r>
+        <w:rPr>
+          <w:rFonts w:hint="eastAsia"/>
+        </w:rPr>
+        <w:t xml:space="preserve">中使用？这里我也进行了尝试，答案是可以成功集成，但有点小坑。</w:t>
+      </w:r>
+      <w:r>
+        <w:t xml:space="preserve"> </w:t>
+      </w:r>
+      <w:r>
+        <w:rPr>
+          <w:rFonts w:hint="eastAsia"/>
+        </w:rPr>
+        <w:t xml:space="preserve">这里就跟大家分享下配置过程，以及Cursor中集成mcp以后的强大能力。让</w:t>
+      </w:r>
+      <w:r>
+        <w:t xml:space="preserve"> AI </w:t>
+      </w:r>
+      <w:r>
+        <w:rPr>
+          <w:rFonts w:hint="eastAsia"/>
+        </w:rPr>
+        <w:t xml:space="preserve">帮助我们完成大部分基本的功能测试已经不再遥远</w:t>
+      </w:r>
+    </w:p>
+    <w:bookmarkStart w:id="59" w:name="在cursor中启用playwright-mcp"/>
+    <w:p>
+      <w:pPr>
+        <w:pStyle w:val="Heading2"/>
+      </w:pPr>
+      <w:r>
+        <w:rPr>
+          <w:rFonts w:hint="eastAsia"/>
+        </w:rPr>
+        <w:t xml:space="preserve">在Cursor中启用playwright-mcp</w:t>
+      </w:r>
+    </w:p>
+    <w:bookmarkStart w:id="47" w:name="预置安装"/>
+    <w:p>
+      <w:pPr>
+        <w:pStyle w:val="Heading3"/>
+      </w:pPr>
+      <w:r>
+        <w:rPr>
+          <w:rFonts w:hint="eastAsia"/>
+        </w:rPr>
+        <w:t xml:space="preserve">预置安装</w:t>
+      </w:r>
+    </w:p>
+    <w:p>
+      <w:pPr>
+        <w:pStyle w:val="FirstParagraph"/>
+      </w:pPr>
+      <w:r>
+        <w:rPr>
+          <w:rFonts w:hint="eastAsia"/>
+        </w:rPr>
+        <w:t xml:space="preserve">首先，当然要先安装mcp</w:t>
+      </w:r>
+      <w:r>
+        <w:t xml:space="preserve"> </w:t>
+      </w:r>
+      <w:r>
+        <w:rPr>
+          <w:rFonts w:hint="eastAsia"/>
+        </w:rPr>
+        <w:t xml:space="preserve">server以及对应的依赖，这里mcp和playwright都是基于nodejs的。所以通过下面命令先安装</w:t>
+      </w:r>
+    </w:p>
+    <w:p>
+      <w:pPr>
+        <w:pStyle w:val="SourceCode"/>
+      </w:pPr>
+      <w:r>
+        <w:rPr>
+          <w:rStyle w:val="VerbatimChar"/>
+        </w:rPr>
+        <w:t xml:space="preserve">npm install -g @playwright/mcp@latest</w:t>
+      </w:r>
+      <w:r>
+        <w:br/>
+      </w:r>
+      <w:r>
+        <w:rPr>
+          <w:rStyle w:val="VerbatimChar"/>
+        </w:rPr>
+        <w:t xml:space="preserve">npm install -g @playwright@latest</w:t>
+      </w:r>
+      <w:r>
+        <w:br/>
+      </w:r>
+      <w:r>
+        <w:rPr>
+          <w:rStyle w:val="VerbatimChar"/>
+        </w:rPr>
+        <w:t xml:space="preserve">npx playwright install --with-deps</w:t>
+      </w:r>
+    </w:p>
     <w:bookmarkEnd w:id="47"/>
+    <w:bookmarkStart w:id="51" w:name="cursor配置"/>
+    <w:p>
+      <w:pPr>
+        <w:pStyle w:val="Heading3"/>
+      </w:pPr>
+      <w:r>
+        <w:rPr>
+          <w:rFonts w:hint="eastAsia"/>
+        </w:rPr>
+        <w:t xml:space="preserve">Cursor配置</w:t>
+      </w:r>
+    </w:p>
+    <w:p>
+      <w:pPr>
+        <w:pStyle w:val="FirstParagraph"/>
+      </w:pPr>
+      <w:r>
+        <w:rPr>
+          <w:rFonts w:hint="eastAsia"/>
+        </w:rPr>
+        <w:t xml:space="preserve">完成安装后，进入</w:t>
+      </w:r>
+      <w:r>
+        <w:t xml:space="preserve"> Cursor </w:t>
+      </w:r>
+      <w:r>
+        <w:rPr>
+          <w:rFonts w:hint="eastAsia"/>
+        </w:rPr>
+        <w:t xml:space="preserve">的设置页面，在其MCP部分，添加</w:t>
+      </w:r>
+      <w:r>
+        <w:t xml:space="preserve"> MCP </w:t>
+      </w:r>
+      <w:r>
+        <w:rPr>
+          <w:rFonts w:hint="eastAsia"/>
+        </w:rPr>
+        <w:t xml:space="preserve">server配置，参照Playwright官网的介绍，</w:t>
+      </w:r>
+      <w:r>
+        <w:t xml:space="preserve"> </w:t>
+      </w:r>
+      <w:r>
+        <w:rPr>
+          <w:rFonts w:hint="eastAsia"/>
+        </w:rPr>
+        <w:t xml:space="preserve">添加mcp</w:t>
+      </w:r>
+      <w:r>
+        <w:t xml:space="preserve"> </w:t>
+      </w:r>
+      <w:r>
+        <w:rPr>
+          <w:rFonts w:hint="eastAsia"/>
+        </w:rPr>
+        <w:t xml:space="preserve">sever配置：</w:t>
+      </w:r>
+    </w:p>
+    <w:p>
+      <w:pPr>
+        <w:pStyle w:val="SourceCode"/>
+      </w:pPr>
+      <w:r>
+        <w:rPr>
+          <w:rStyle w:val="FunctionTok"/>
+        </w:rPr>
+        <w:t xml:space="preserve">{</w:t>
+      </w:r>
+      <w:r>
+        <w:br/>
+      </w:r>
+      <w:r>
+        <w:rPr>
+          <w:rStyle w:val="NormalTok"/>
+        </w:rPr>
+        <w:t xml:space="preserve">  </w:t>
+      </w:r>
+      <w:r>
+        <w:rPr>
+          <w:rStyle w:val="DataTypeTok"/>
+        </w:rPr>
+        <w:t xml:space="preserve">"mcpServers"</w:t>
+      </w:r>
+      <w:r>
+        <w:rPr>
+          <w:rStyle w:val="FunctionTok"/>
+        </w:rPr>
+        <w:t xml:space="preserve">:</w:t>
+      </w:r>
+      <w:r>
+        <w:rPr>
+          <w:rStyle w:val="NormalTok"/>
+        </w:rPr>
+        <w:t xml:space="preserve"> </w:t>
+      </w:r>
+      <w:r>
+        <w:rPr>
+          <w:rStyle w:val="FunctionTok"/>
+        </w:rPr>
+        <w:t xml:space="preserve">{</w:t>
+      </w:r>
+      <w:r>
+        <w:br/>
+      </w:r>
+      <w:r>
+        <w:rPr>
+          <w:rStyle w:val="NormalTok"/>
+        </w:rPr>
+        <w:t xml:space="preserve">    </w:t>
+      </w:r>
+      <w:r>
+        <w:rPr>
+          <w:rStyle w:val="DataTypeTok"/>
+        </w:rPr>
+        <w:t xml:space="preserve">"playwright"</w:t>
+      </w:r>
+      <w:r>
+        <w:rPr>
+          <w:rStyle w:val="FunctionTok"/>
+        </w:rPr>
+        <w:t xml:space="preserve">:</w:t>
+      </w:r>
+      <w:r>
+        <w:rPr>
+          <w:rStyle w:val="NormalTok"/>
+        </w:rPr>
+        <w:t xml:space="preserve"> </w:t>
+      </w:r>
+      <w:r>
+        <w:rPr>
+          <w:rStyle w:val="FunctionTok"/>
+        </w:rPr>
+        <w:t xml:space="preserve">{</w:t>
+      </w:r>
+      <w:r>
+        <w:br/>
+      </w:r>
+      <w:r>
+        <w:rPr>
+          <w:rStyle w:val="NormalTok"/>
+        </w:rPr>
+        <w:t xml:space="preserve">      </w:t>
+      </w:r>
+      <w:r>
+        <w:rPr>
+          <w:rStyle w:val="DataTypeTok"/>
+        </w:rPr>
+        <w:t xml:space="preserve">"command"</w:t>
+      </w:r>
+      <w:r>
+        <w:rPr>
+          <w:rStyle w:val="FunctionTok"/>
+        </w:rPr>
+        <w:t xml:space="preserve">:</w:t>
+      </w:r>
+      <w:r>
+        <w:rPr>
+          <w:rStyle w:val="NormalTok"/>
+        </w:rPr>
+        <w:t xml:space="preserve"> </w:t>
+      </w:r>
+      <w:r>
+        <w:rPr>
+          <w:rStyle w:val="StringTok"/>
+        </w:rPr>
+        <w:t xml:space="preserve">"npx"</w:t>
+      </w:r>
+      <w:r>
+        <w:rPr>
+          <w:rStyle w:val="FunctionTok"/>
+        </w:rPr>
+        <w:t xml:space="preserve">,</w:t>
+      </w:r>
+      <w:r>
+        <w:br/>
+      </w:r>
+      <w:r>
+        <w:rPr>
+          <w:rStyle w:val="NormalTok"/>
+        </w:rPr>
+        <w:t xml:space="preserve">      </w:t>
+      </w:r>
+      <w:r>
+        <w:rPr>
+          <w:rStyle w:val="DataTypeTok"/>
+        </w:rPr>
+        <w:t xml:space="preserve">"args"</w:t>
+      </w:r>
+      <w:r>
+        <w:rPr>
+          <w:rStyle w:val="FunctionTok"/>
+        </w:rPr>
+        <w:t xml:space="preserve">:</w:t>
+      </w:r>
+      <w:r>
+        <w:rPr>
+          <w:rStyle w:val="NormalTok"/>
+        </w:rPr>
+        <w:t xml:space="preserve"> </w:t>
+      </w:r>
+      <w:r>
+        <w:rPr>
+          <w:rStyle w:val="OtherTok"/>
+        </w:rPr>
+        <w:t xml:space="preserve">[</w:t>
+      </w:r>
+      <w:r>
+        <w:br/>
+      </w:r>
+      <w:r>
+        <w:rPr>
+          <w:rStyle w:val="NormalTok"/>
+        </w:rPr>
+        <w:t xml:space="preserve">        </w:t>
+      </w:r>
+      <w:r>
+        <w:rPr>
+          <w:rStyle w:val="StringTok"/>
+        </w:rPr>
+        <w:t xml:space="preserve">"@playwright/mcp@latest"</w:t>
+      </w:r>
+      <w:r>
+        <w:br/>
+      </w:r>
+      <w:r>
+        <w:rPr>
+          <w:rStyle w:val="NormalTok"/>
+        </w:rPr>
+        <w:t xml:space="preserve">      </w:t>
+      </w:r>
+      <w:r>
+        <w:rPr>
+          <w:rStyle w:val="OtherTok"/>
+        </w:rPr>
+        <w:t xml:space="preserve">]</w:t>
+      </w:r>
+      <w:r>
+        <w:br/>
+      </w:r>
+      <w:r>
+        <w:rPr>
+          <w:rStyle w:val="NormalTok"/>
+        </w:rPr>
+        <w:t xml:space="preserve">    </w:t>
+      </w:r>
+      <w:r>
+        <w:rPr>
+          <w:rStyle w:val="FunctionTok"/>
+        </w:rPr>
+        <w:t xml:space="preserve">}</w:t>
+      </w:r>
+      <w:r>
+        <w:br/>
+      </w:r>
+      <w:r>
+        <w:rPr>
+          <w:rStyle w:val="NormalTok"/>
+        </w:rPr>
+        <w:t xml:space="preserve">  </w:t>
+      </w:r>
+      <w:r>
+        <w:rPr>
+          <w:rStyle w:val="FunctionTok"/>
+        </w:rPr>
+        <w:t xml:space="preserve">}</w:t>
+      </w:r>
+      <w:r>
+        <w:br/>
+      </w:r>
+      <w:r>
+        <w:rPr>
+          <w:rStyle w:val="FunctionTok"/>
+        </w:rPr>
+        <w:t xml:space="preserve">}</w:t>
+      </w:r>
+    </w:p>
+    <w:p>
+      <w:pPr>
+        <w:pStyle w:val="FirstParagraph"/>
+      </w:pPr>
+      <w:r>
+        <w:rPr>
+          <w:rFonts w:hint="eastAsia"/>
+        </w:rPr>
+        <w:t xml:space="preserve">但这时，cursor中的mcp</w:t>
+      </w:r>
+      <w:r>
+        <w:t xml:space="preserve"> </w:t>
+      </w:r>
+      <w:r>
+        <w:rPr>
+          <w:rFonts w:hint="eastAsia"/>
+        </w:rPr>
+        <w:t xml:space="preserve">server实际并不能正常运行，会显示</w:t>
+      </w:r>
+      <w:r>
+        <w:t xml:space="preserve"> </w:t>
+      </w:r>
+      <w:r>
+        <w:rPr>
+          <w:rStyle w:val="VerbatimChar"/>
+        </w:rPr>
+        <w:t xml:space="preserve">Clint closed</w:t>
+      </w:r>
+    </w:p>
+    <w:p>
+      <w:pPr>
+        <w:pStyle w:val="BodyText"/>
+      </w:pPr>
+      <w:r>
+        <w:drawing>
+          <wp:inline>
+            <wp:extent cx="5334000" cy="2077892"/>
+            <wp:effectExtent b="0" l="0" r="0" t="0"/>
+            <wp:docPr descr="" title="" id="49" name="Picture"/>
+            <a:graphic>
+              <a:graphicData uri="http://schemas.openxmlformats.org/drawingml/2006/picture">
+                <pic:pic>
+                  <pic:nvPicPr>
+                    <pic:cNvPr descr="-20250404.png" id="50" name="Picture"/>
+                    <pic:cNvPicPr>
+                      <a:picLocks noChangeArrowheads="1" noChangeAspect="1"/>
+                    </pic:cNvPicPr>
+                  </pic:nvPicPr>
+                  <pic:blipFill>
+                    <a:blip r:embed="rId48"/>
+                    <a:stretch>
+                      <a:fillRect/>
+                    </a:stretch>
+                  </pic:blipFill>
+                  <pic:spPr bwMode="auto">
+                    <a:xfrm>
+                      <a:off x="0" y="0"/>
+                      <a:ext cx="5334000" cy="2077892"/>
+                    </a:xfrm>
+                    <a:prstGeom prst="rect">
+                      <a:avLst/>
+                    </a:prstGeom>
+                    <a:noFill/>
+                    <a:ln w="9525">
+                      <a:noFill/>
+                      <a:headEnd/>
+                      <a:tailEnd/>
+                    </a:ln>
+                  </pic:spPr>
+                </pic:pic>
+              </a:graphicData>
+            </a:graphic>
+          </wp:inline>
+        </w:drawing>
+      </w:r>
+    </w:p>
+    <w:bookmarkEnd w:id="51"/>
+    <w:bookmarkStart w:id="58" w:name="windows系统安装要规避两个坑"/>
+    <w:p>
+      <w:pPr>
+        <w:pStyle w:val="Heading3"/>
+      </w:pPr>
+      <w:r>
+        <w:rPr>
+          <w:rFonts w:hint="eastAsia"/>
+        </w:rPr>
+        <w:t xml:space="preserve">windows系统安装，要规避两个坑</w:t>
+      </w:r>
+    </w:p>
+    <w:p>
+      <w:pPr>
+        <w:pStyle w:val="FirstParagraph"/>
+      </w:pPr>
+      <w:r>
+        <w:rPr>
+          <w:rFonts w:hint="eastAsia"/>
+          <w:b/>
+          <w:bCs/>
+        </w:rPr>
+        <w:t xml:space="preserve">第一个坑：npx</w:t>
+      </w:r>
+      <w:r>
+        <w:rPr>
+          <w:b/>
+          <w:bCs/>
+        </w:rPr>
+        <w:t xml:space="preserve"> </w:t>
+      </w:r>
+      <w:r>
+        <w:rPr>
+          <w:rFonts w:hint="eastAsia"/>
+          <w:b/>
+          <w:bCs/>
+        </w:rPr>
+        <w:t xml:space="preserve">包加载路径应该加入搜索路径</w:t>
+      </w:r>
+    </w:p>
+    <w:p>
+      <w:pPr>
+        <w:pStyle w:val="BodyText"/>
+      </w:pPr>
+      <w:r>
+        <w:rPr>
+          <w:rFonts w:hint="eastAsia"/>
+        </w:rPr>
+        <w:t xml:space="preserve">也就是要将全局安装的相关包，放到nodejs的搜索路径中。做法是在windows系统的环境变量中，把npm包目录加入path中，并放到nodejs之前</w:t>
+      </w:r>
+    </w:p>
+    <w:p>
+      <w:pPr>
+        <w:pStyle w:val="BodyText"/>
+      </w:pPr>
+      <w:r>
+        <w:drawing>
+          <wp:inline>
+            <wp:extent cx="5334000" cy="5890397"/>
+            <wp:effectExtent b="0" l="0" r="0" t="0"/>
+            <wp:docPr descr="" title="" id="53" name="Picture"/>
+            <a:graphic>
+              <a:graphicData uri="http://schemas.openxmlformats.org/drawingml/2006/picture">
+                <pic:pic>
+                  <pic:nvPicPr>
+                    <pic:cNvPr descr="Pasted-20250404.png" id="54" name="Picture"/>
+                    <pic:cNvPicPr>
+                      <a:picLocks noChangeArrowheads="1" noChangeAspect="1"/>
+                    </pic:cNvPicPr>
+                  </pic:nvPicPr>
+                  <pic:blipFill>
+                    <a:blip r:embed="rId52"/>
+                    <a:stretch>
+                      <a:fillRect/>
+                    </a:stretch>
+                  </pic:blipFill>
+                  <pic:spPr bwMode="auto">
+                    <a:xfrm>
+                      <a:off x="0" y="0"/>
+                      <a:ext cx="5334000" cy="5890397"/>
+                    </a:xfrm>
+                    <a:prstGeom prst="rect">
+                      <a:avLst/>
+                    </a:prstGeom>
+                    <a:noFill/>
+                    <a:ln w="9525">
+                      <a:noFill/>
+                      <a:headEnd/>
+                      <a:tailEnd/>
+                    </a:ln>
+                  </pic:spPr>
+                </pic:pic>
+              </a:graphicData>
+            </a:graphic>
+          </wp:inline>
+        </w:drawing>
+      </w:r>
+    </w:p>
+    <w:p>
+      <w:pPr>
+        <w:pStyle w:val="BodyText"/>
+      </w:pPr>
+      <w:r>
+        <w:rPr>
+          <w:rFonts w:hint="eastAsia"/>
+          <w:b/>
+          <w:bCs/>
+        </w:rPr>
+        <w:t xml:space="preserve">第二个坑：修改mcp命令行调用命令</w:t>
+      </w:r>
+    </w:p>
+    <w:p>
+      <w:pPr>
+        <w:pStyle w:val="BodyText"/>
+      </w:pPr>
+      <w:r>
+        <w:rPr>
+          <w:rFonts w:hint="eastAsia"/>
+        </w:rPr>
+        <w:t xml:space="preserve">cursor中调用npx，其实是通过命令行调用的，但windows系统下，直接通过命令行调用npx，cursor本身并不能拿到调用状态，所以这里要用</w:t>
+      </w:r>
+      <w:r>
+        <w:t xml:space="preserve"> </w:t>
+      </w:r>
+      <w:r>
+        <w:rPr>
+          <w:rStyle w:val="VerbatimChar"/>
+        </w:rPr>
+        <w:t xml:space="preserve">cmd /c</w:t>
+      </w:r>
+      <w:r>
+        <w:t xml:space="preserve"> </w:t>
+      </w:r>
+      <w:r>
+        <w:rPr>
+          <w:rFonts w:hint="eastAsia"/>
+        </w:rPr>
+        <w:t xml:space="preserve">命令调用,</w:t>
+      </w:r>
+      <w:r>
+        <w:t xml:space="preserve"> </w:t>
+      </w:r>
+      <w:r>
+        <w:rPr>
+          <w:rFonts w:hint="eastAsia"/>
+        </w:rPr>
+        <w:t xml:space="preserve">获取命令句柄</w:t>
+      </w:r>
+    </w:p>
+    <w:p>
+      <w:pPr>
+        <w:pStyle w:val="BodyText"/>
+      </w:pPr>
+      <w:r>
+        <w:rPr>
+          <w:rFonts w:hint="eastAsia"/>
+        </w:rPr>
+        <w:t xml:space="preserve">也就是上面的配置文件，修改成：</w:t>
+      </w:r>
+    </w:p>
+    <w:p>
+      <w:pPr>
+        <w:pStyle w:val="SourceCode"/>
+      </w:pPr>
+      <w:r>
+        <w:rPr>
+          <w:rStyle w:val="FunctionTok"/>
+        </w:rPr>
+        <w:t xml:space="preserve">{</w:t>
+      </w:r>
+      <w:r>
+        <w:br/>
+      </w:r>
+      <w:r>
+        <w:rPr>
+          <w:rStyle w:val="NormalTok"/>
+        </w:rPr>
+        <w:t xml:space="preserve">  </w:t>
+      </w:r>
+      <w:r>
+        <w:rPr>
+          <w:rStyle w:val="DataTypeTok"/>
+        </w:rPr>
+        <w:t xml:space="preserve">"mcpServers"</w:t>
+      </w:r>
+      <w:r>
+        <w:rPr>
+          <w:rStyle w:val="FunctionTok"/>
+        </w:rPr>
+        <w:t xml:space="preserve">:</w:t>
+      </w:r>
+      <w:r>
+        <w:rPr>
+          <w:rStyle w:val="NormalTok"/>
+        </w:rPr>
+        <w:t xml:space="preserve"> </w:t>
+      </w:r>
+      <w:r>
+        <w:rPr>
+          <w:rStyle w:val="FunctionTok"/>
+        </w:rPr>
+        <w:t xml:space="preserve">{</w:t>
+      </w:r>
+      <w:r>
+        <w:br/>
+      </w:r>
+      <w:r>
+        <w:rPr>
+          <w:rStyle w:val="NormalTok"/>
+        </w:rPr>
+        <w:t xml:space="preserve">    </w:t>
+      </w:r>
+      <w:r>
+        <w:rPr>
+          <w:rStyle w:val="DataTypeTok"/>
+        </w:rPr>
+        <w:t xml:space="preserve">"playwright"</w:t>
+      </w:r>
+      <w:r>
+        <w:rPr>
+          <w:rStyle w:val="FunctionTok"/>
+        </w:rPr>
+        <w:t xml:space="preserve">:</w:t>
+      </w:r>
+      <w:r>
+        <w:rPr>
+          <w:rStyle w:val="NormalTok"/>
+        </w:rPr>
+        <w:t xml:space="preserve"> </w:t>
+      </w:r>
+      <w:r>
+        <w:rPr>
+          <w:rStyle w:val="FunctionTok"/>
+        </w:rPr>
+        <w:t xml:space="preserve">{</w:t>
+      </w:r>
+      <w:r>
+        <w:br/>
+      </w:r>
+      <w:r>
+        <w:rPr>
+          <w:rStyle w:val="NormalTok"/>
+        </w:rPr>
+        <w:t xml:space="preserve">      </w:t>
+      </w:r>
+      <w:r>
+        <w:rPr>
+          <w:rStyle w:val="DataTypeTok"/>
+        </w:rPr>
+        <w:t xml:space="preserve">"command"</w:t>
+      </w:r>
+      <w:r>
+        <w:rPr>
+          <w:rStyle w:val="FunctionTok"/>
+        </w:rPr>
+        <w:t xml:space="preserve">:</w:t>
+      </w:r>
+      <w:r>
+        <w:rPr>
+          <w:rStyle w:val="NormalTok"/>
+        </w:rPr>
+        <w:t xml:space="preserve"> </w:t>
+      </w:r>
+      <w:r>
+        <w:rPr>
+          <w:rStyle w:val="StringTok"/>
+        </w:rPr>
+        <w:t xml:space="preserve">"cmd /c npx"</w:t>
+      </w:r>
+      <w:r>
+        <w:rPr>
+          <w:rStyle w:val="FunctionTok"/>
+        </w:rPr>
+        <w:t xml:space="preserve">,</w:t>
+      </w:r>
+      <w:r>
+        <w:br/>
+      </w:r>
+      <w:r>
+        <w:rPr>
+          <w:rStyle w:val="NormalTok"/>
+        </w:rPr>
+        <w:t xml:space="preserve">      </w:t>
+      </w:r>
+      <w:r>
+        <w:rPr>
+          <w:rStyle w:val="DataTypeTok"/>
+        </w:rPr>
+        <w:t xml:space="preserve">"args"</w:t>
+      </w:r>
+      <w:r>
+        <w:rPr>
+          <w:rStyle w:val="FunctionTok"/>
+        </w:rPr>
+        <w:t xml:space="preserve">:</w:t>
+      </w:r>
+      <w:r>
+        <w:rPr>
+          <w:rStyle w:val="NormalTok"/>
+        </w:rPr>
+        <w:t xml:space="preserve"> </w:t>
+      </w:r>
+      <w:r>
+        <w:rPr>
+          <w:rStyle w:val="OtherTok"/>
+        </w:rPr>
+        <w:t xml:space="preserve">[</w:t>
+      </w:r>
+      <w:r>
+        <w:br/>
+      </w:r>
+      <w:r>
+        <w:rPr>
+          <w:rStyle w:val="NormalTok"/>
+        </w:rPr>
+        <w:t xml:space="preserve">        </w:t>
+      </w:r>
+      <w:r>
+        <w:rPr>
+          <w:rStyle w:val="StringTok"/>
+        </w:rPr>
+        <w:t xml:space="preserve">"@playwright/mcp@latest"</w:t>
+      </w:r>
+      <w:r>
+        <w:br/>
+      </w:r>
+      <w:r>
+        <w:rPr>
+          <w:rStyle w:val="NormalTok"/>
+        </w:rPr>
+        <w:t xml:space="preserve">      </w:t>
+      </w:r>
+      <w:r>
+        <w:rPr>
+          <w:rStyle w:val="OtherTok"/>
+        </w:rPr>
+        <w:t xml:space="preserve">]</w:t>
+      </w:r>
+      <w:r>
+        <w:br/>
+      </w:r>
+      <w:r>
+        <w:rPr>
+          <w:rStyle w:val="NormalTok"/>
+        </w:rPr>
+        <w:t xml:space="preserve">    </w:t>
+      </w:r>
+      <w:r>
+        <w:rPr>
+          <w:rStyle w:val="FunctionTok"/>
+        </w:rPr>
+        <w:t xml:space="preserve">}</w:t>
+      </w:r>
+      <w:r>
+        <w:br/>
+      </w:r>
+      <w:r>
+        <w:rPr>
+          <w:rStyle w:val="NormalTok"/>
+        </w:rPr>
+        <w:t xml:space="preserve">  </w:t>
+      </w:r>
+      <w:r>
+        <w:rPr>
+          <w:rStyle w:val="FunctionTok"/>
+        </w:rPr>
+        <w:t xml:space="preserve">}</w:t>
+      </w:r>
+      <w:r>
+        <w:br/>
+      </w:r>
+      <w:r>
+        <w:rPr>
+          <w:rStyle w:val="FunctionTok"/>
+        </w:rPr>
+        <w:t xml:space="preserve">}</w:t>
+      </w:r>
+    </w:p>
+    <w:p>
+      <w:pPr>
+        <w:pStyle w:val="FirstParagraph"/>
+      </w:pPr>
+      <w:r>
+        <w:rPr>
+          <w:rFonts w:hint="eastAsia"/>
+        </w:rPr>
+        <w:t xml:space="preserve">修改以上配置后，重新加载cursor，这时会启动一个命令行窗口，其实就是playwright-mcp，不要关闭，然后可以看到</w:t>
+      </w:r>
+      <w:r>
+        <w:t xml:space="preserve"> </w:t>
+      </w:r>
+      <w:r>
+        <w:rPr>
+          <w:rFonts w:hint="eastAsia"/>
+        </w:rPr>
+        <w:t xml:space="preserve">Cursor中mcp也正常启动了</w:t>
+      </w:r>
+    </w:p>
+    <w:p>
+      <w:pPr>
+        <w:pStyle w:val="BodyText"/>
+      </w:pPr>
+      <w:r>
+        <w:drawing>
+          <wp:inline>
+            <wp:extent cx="5334000" cy="3890966"/>
+            <wp:effectExtent b="0" l="0" r="0" t="0"/>
+            <wp:docPr descr="" title="" id="56" name="Picture"/>
+            <a:graphic>
+              <a:graphicData uri="http://schemas.openxmlformats.org/drawingml/2006/picture">
+                <pic:pic>
+                  <pic:nvPicPr>
+                    <pic:cNvPr descr="Pasted-20250403.png" id="57" name="Picture"/>
+                    <pic:cNvPicPr>
+                      <a:picLocks noChangeArrowheads="1" noChangeAspect="1"/>
+                    </pic:cNvPicPr>
+                  </pic:nvPicPr>
+                  <pic:blipFill>
+                    <a:blip r:embed="rId55"/>
+                    <a:stretch>
+                      <a:fillRect/>
+                    </a:stretch>
+                  </pic:blipFill>
+                  <pic:spPr bwMode="auto">
+                    <a:xfrm>
+                      <a:off x="0" y="0"/>
+                      <a:ext cx="5334000" cy="3890966"/>
+                    </a:xfrm>
+                    <a:prstGeom prst="rect">
+                      <a:avLst/>
+                    </a:prstGeom>
+                    <a:noFill/>
+                    <a:ln w="9525">
+                      <a:noFill/>
+                      <a:headEnd/>
+                      <a:tailEnd/>
+                    </a:ln>
+                  </pic:spPr>
+                </pic:pic>
+              </a:graphicData>
+            </a:graphic>
+          </wp:inline>
+        </w:drawing>
+      </w:r>
+    </w:p>
+    <w:bookmarkEnd w:id="58"/>
+    <w:bookmarkEnd w:id="59"/>
+    <w:bookmarkStart w:id="63" w:name="让-playwright-mcp-代替我们执行测试"/>
+    <w:p>
+      <w:pPr>
+        <w:pStyle w:val="Heading2"/>
+      </w:pPr>
+      <w:r>
+        <w:rPr>
+          <w:rFonts w:hint="eastAsia"/>
+        </w:rPr>
+        <w:t xml:space="preserve">让</w:t>
+      </w:r>
+      <w:r>
+        <w:t xml:space="preserve"> playwright-mcp </w:t>
+      </w:r>
+      <w:r>
+        <w:rPr>
+          <w:rFonts w:hint="eastAsia"/>
+        </w:rPr>
+        <w:t xml:space="preserve">代替我们执行测试</w:t>
+      </w:r>
+    </w:p>
+    <w:p>
+      <w:pPr>
+        <w:pStyle w:val="FirstParagraph"/>
+      </w:pPr>
+      <w:r>
+        <w:rPr>
+          <w:rFonts w:hint="eastAsia"/>
+        </w:rPr>
+        <w:t xml:space="preserve">我们在Cursor中输入一个基本的任务指令：</w:t>
+      </w:r>
+    </w:p>
+    <w:p>
+      <w:pPr>
+        <w:pStyle w:val="BlockText"/>
+      </w:pPr>
+      <w:r>
+        <w:rPr>
+          <w:rFonts w:hint="eastAsia"/>
+        </w:rPr>
+        <w:t xml:space="preserve">访问www.saucedemo.com网站，使用problem_user登录，验证该网站完整流程并记录发现的问题</w:t>
+      </w:r>
+    </w:p>
+    <w:p>
+      <w:pPr>
+        <w:pStyle w:val="FirstParagraph"/>
+      </w:pPr>
+      <w:r>
+        <w:rPr>
+          <w:rFonts w:hint="eastAsia"/>
+        </w:rPr>
+        <w:t xml:space="preserve">以下是完整执行过程</w:t>
+      </w:r>
+    </w:p>
+    <w:p>
+      <w:pPr>
+        <w:pStyle w:val="SourceCode"/>
+      </w:pPr>
+      <w:r>
+        <w:br/>
+      </w:r>
+      <w:r>
+        <w:rPr>
+          <w:rStyle w:val="VerbatimChar"/>
+          <w:rFonts w:hint="eastAsia"/>
+        </w:rPr>
+        <w:t xml:space="preserve">我将帮您访问</w:t>
+      </w:r>
+      <w:r>
+        <w:rPr>
+          <w:rStyle w:val="VerbatimChar"/>
+        </w:rPr>
+        <w:t xml:space="preserve"> Sauce Demo </w:t>
+      </w:r>
+      <w:r>
+        <w:rPr>
+          <w:rStyle w:val="VerbatimChar"/>
+          <w:rFonts w:hint="eastAsia"/>
+        </w:rPr>
+        <w:t xml:space="preserve">网站并使用</w:t>
+      </w:r>
+      <w:r>
+        <w:rPr>
+          <w:rStyle w:val="VerbatimChar"/>
+        </w:rPr>
+        <w:t xml:space="preserve"> problem_user </w:t>
+      </w:r>
+      <w:r>
+        <w:rPr>
+          <w:rStyle w:val="VerbatimChar"/>
+          <w:rFonts w:hint="eastAsia"/>
+        </w:rPr>
+        <w:t xml:space="preserve">账号进行完整测试流程验证。让我们开始吧。</w:t>
+      </w:r>
+      <w:r>
+        <w:br/>
+      </w:r>
+      <w:r>
+        <w:br/>
+      </w:r>
+      <w:r>
+        <w:rPr>
+          <w:rStyle w:val="VerbatimChar"/>
+          <w:rFonts w:hint="eastAsia"/>
+        </w:rPr>
+        <w:t xml:space="preserve">首先，让我访问网站：</w:t>
+      </w:r>
+      <w:r>
+        <w:br/>
+      </w:r>
+      <w:r>
+        <w:br/>
+      </w:r>
+      <w:r>
+        <w:rPr>
+          <w:rStyle w:val="VerbatimChar"/>
+        </w:rPr>
+        <w:t xml:space="preserve">Called MCP toolbrowser_navigate</w:t>
+      </w:r>
+      <w:r>
+        <w:br/>
+      </w:r>
+      <w:r>
+        <w:br/>
+      </w:r>
+      <w:r>
+        <w:rPr>
+          <w:rStyle w:val="VerbatimChar"/>
+          <w:rFonts w:hint="eastAsia"/>
+        </w:rPr>
+        <w:t xml:space="preserve">让我使用</w:t>
+      </w:r>
+      <w:r>
+        <w:rPr>
+          <w:rStyle w:val="VerbatimChar"/>
+        </w:rPr>
+        <w:t xml:space="preserve"> problem_user </w:t>
+      </w:r>
+      <w:r>
+        <w:rPr>
+          <w:rStyle w:val="VerbatimChar"/>
+          <w:rFonts w:hint="eastAsia"/>
+        </w:rPr>
+        <w:t xml:space="preserve">账号登录：</w:t>
+      </w:r>
+      <w:r>
+        <w:br/>
+      </w:r>
+      <w:r>
+        <w:br/>
+      </w:r>
+      <w:r>
+        <w:rPr>
+          <w:rStyle w:val="VerbatimChar"/>
+        </w:rPr>
+        <w:t xml:space="preserve">Called MCP toolbrowser_type</w:t>
+      </w:r>
+      <w:r>
+        <w:br/>
+      </w:r>
+      <w:r>
+        <w:br/>
+      </w:r>
+      <w:r>
+        <w:rPr>
+          <w:rStyle w:val="VerbatimChar"/>
+          <w:rFonts w:hint="eastAsia"/>
+        </w:rPr>
+        <w:t xml:space="preserve">现在输入密码：</w:t>
+      </w:r>
+      <w:r>
+        <w:br/>
+      </w:r>
+      <w:r>
+        <w:br/>
+      </w:r>
+      <w:r>
+        <w:rPr>
+          <w:rStyle w:val="VerbatimChar"/>
+        </w:rPr>
+        <w:t xml:space="preserve">Called MCP toolbrowser_type</w:t>
+      </w:r>
+      <w:r>
+        <w:br/>
+      </w:r>
+      <w:r>
+        <w:br/>
+      </w:r>
+      <w:r>
+        <w:rPr>
+          <w:rStyle w:val="VerbatimChar"/>
+          <w:rFonts w:hint="eastAsia"/>
+        </w:rPr>
+        <w:t xml:space="preserve">点击登录按钮：</w:t>
+      </w:r>
+      <w:r>
+        <w:br/>
+      </w:r>
+      <w:r>
+        <w:br/>
+      </w:r>
+      <w:r>
+        <w:rPr>
+          <w:rStyle w:val="VerbatimChar"/>
+        </w:rPr>
+        <w:t xml:space="preserve">Called MCP toolbrowser_click</w:t>
+      </w:r>
+      <w:r>
+        <w:br/>
+      </w:r>
+      <w:r>
+        <w:br/>
+      </w:r>
+      <w:r>
+        <w:rPr>
+          <w:rStyle w:val="VerbatimChar"/>
+          <w:rFonts w:hint="eastAsia"/>
+        </w:rPr>
+        <w:t xml:space="preserve">让我们开始测试并记录问题。首先我注意到以下问题：</w:t>
+      </w:r>
+      <w:r>
+        <w:br/>
+      </w:r>
+      <w:r>
+        <w:br/>
+      </w:r>
+      <w:r>
+        <w:rPr>
+          <w:rStyle w:val="VerbatimChar"/>
+        </w:rPr>
+        <w:t xml:space="preserve">1. </w:t>
+      </w:r>
+      <w:r>
+        <w:rPr>
+          <w:rStyle w:val="VerbatimChar"/>
+          <w:rFonts w:hint="eastAsia"/>
+        </w:rPr>
+        <w:t xml:space="preserve">商品图片问题：</w:t>
+      </w:r>
+      <w:r>
+        <w:br/>
+      </w:r>
+      <w:r>
+        <w:br/>
+      </w:r>
+      <w:r>
+        <w:rPr>
+          <w:rStyle w:val="VerbatimChar"/>
+          <w:rFonts w:hint="eastAsia"/>
+        </w:rPr>
+        <w:t xml:space="preserve">所有商品的图片都显示相同的图片（狗的图片），这明显是一个bug，因为每个商品应该显示其独特的产品图片。</w:t>
+      </w:r>
+      <w:r>
+        <w:br/>
+      </w:r>
+      <w:r>
+        <w:br/>
+      </w:r>
+      <w:r>
+        <w:rPr>
+          <w:rStyle w:val="VerbatimChar"/>
+          <w:rFonts w:hint="eastAsia"/>
+        </w:rPr>
+        <w:t xml:space="preserve">让我尝试添加商品到购物车：</w:t>
+      </w:r>
+      <w:r>
+        <w:br/>
+      </w:r>
+      <w:r>
+        <w:br/>
+      </w:r>
+      <w:r>
+        <w:rPr>
+          <w:rStyle w:val="VerbatimChar"/>
+        </w:rPr>
+        <w:t xml:space="preserve">Called MCP toolbrowser_click</w:t>
+      </w:r>
+      <w:r>
+        <w:br/>
+      </w:r>
+      <w:r>
+        <w:br/>
+      </w:r>
+      <w:r>
+        <w:rPr>
+          <w:rStyle w:val="VerbatimChar"/>
+          <w:rFonts w:hint="eastAsia"/>
+        </w:rPr>
+        <w:t xml:space="preserve">让我点击购物车图标查看购物车：</w:t>
+      </w:r>
+      <w:r>
+        <w:br/>
+      </w:r>
+      <w:r>
+        <w:br/>
+      </w:r>
+      <w:r>
+        <w:rPr>
+          <w:rStyle w:val="VerbatimChar"/>
+        </w:rPr>
+        <w:t xml:space="preserve">Called MCP toolbrowser_click</w:t>
+      </w:r>
+      <w:r>
+        <w:br/>
+      </w:r>
+      <w:r>
+        <w:br/>
+      </w:r>
+      <w:r>
+        <w:rPr>
+          <w:rStyle w:val="VerbatimChar"/>
+          <w:rFonts w:hint="eastAsia"/>
+        </w:rPr>
+        <w:t xml:space="preserve">让我们返回商品列表并尝试使用排序功能：</w:t>
+      </w:r>
+      <w:r>
+        <w:br/>
+      </w:r>
+      <w:r>
+        <w:br/>
+      </w:r>
+      <w:r>
+        <w:rPr>
+          <w:rStyle w:val="VerbatimChar"/>
+        </w:rPr>
+        <w:t xml:space="preserve">Called MCP toolbrowser_click</w:t>
+      </w:r>
+      <w:r>
+        <w:br/>
+      </w:r>
+      <w:r>
+        <w:br/>
+      </w:r>
+      <w:r>
+        <w:rPr>
+          <w:rStyle w:val="VerbatimChar"/>
+          <w:rFonts w:hint="eastAsia"/>
+        </w:rPr>
+        <w:t xml:space="preserve">让我尝试使用排序功能：</w:t>
+      </w:r>
+      <w:r>
+        <w:br/>
+      </w:r>
+      <w:r>
+        <w:br/>
+      </w:r>
+      <w:r>
+        <w:rPr>
+          <w:rStyle w:val="VerbatimChar"/>
+        </w:rPr>
+        <w:t xml:space="preserve">Called MCP toolbrowser_click</w:t>
+      </w:r>
+      <w:r>
+        <w:br/>
+      </w:r>
+      <w:r>
+        <w:br/>
+      </w:r>
+      <w:r>
+        <w:rPr>
+          <w:rStyle w:val="VerbatimChar"/>
+        </w:rPr>
+        <w:t xml:space="preserve">Called MCP toolbrowser_select_option</w:t>
+      </w:r>
+      <w:r>
+        <w:br/>
+      </w:r>
+      <w:r>
+        <w:br/>
+      </w:r>
+      <w:r>
+        <w:rPr>
+          <w:rStyle w:val="VerbatimChar"/>
+          <w:rFonts w:hint="eastAsia"/>
+        </w:rPr>
+        <w:t xml:space="preserve">基于测试过程，我发现了以下问题：</w:t>
+      </w:r>
+      <w:r>
+        <w:br/>
+      </w:r>
+      <w:r>
+        <w:br/>
+      </w:r>
+      <w:r>
+        <w:rPr>
+          <w:rStyle w:val="VerbatimChar"/>
+        </w:rPr>
+        <w:t xml:space="preserve">1. </w:t>
+      </w:r>
+      <w:r>
+        <w:rPr>
+          <w:rStyle w:val="VerbatimChar"/>
+          <w:rFonts w:hint="eastAsia"/>
+        </w:rPr>
+        <w:t xml:space="preserve">图片显示问题：</w:t>
+      </w:r>
+      <w:r>
+        <w:br/>
+      </w:r>
+      <w:r>
+        <w:br/>
+      </w:r>
+      <w:r>
+        <w:rPr>
+          <w:rStyle w:val="VerbatimChar"/>
+        </w:rPr>
+        <w:t xml:space="preserve">- </w:t>
+      </w:r>
+      <w:r>
+        <w:rPr>
+          <w:rStyle w:val="VerbatimChar"/>
+          <w:rFonts w:hint="eastAsia"/>
+        </w:rPr>
+        <w:t xml:space="preserve">所有商品的图片都显示为相同的狗图片，而不是各自的产品图片</w:t>
+      </w:r>
+      <w:r>
+        <w:br/>
+      </w:r>
+      <w:r>
+        <w:br/>
+      </w:r>
+      <w:r>
+        <w:rPr>
+          <w:rStyle w:val="VerbatimChar"/>
+        </w:rPr>
+        <w:t xml:space="preserve">- </w:t>
+      </w:r>
+      <w:r>
+        <w:rPr>
+          <w:rStyle w:val="VerbatimChar"/>
+          <w:rFonts w:hint="eastAsia"/>
+        </w:rPr>
+        <w:t xml:space="preserve">这影响了用户对产品的视觉识别</w:t>
+      </w:r>
+      <w:r>
+        <w:br/>
+      </w:r>
+      <w:r>
+        <w:br/>
+      </w:r>
+      <w:r>
+        <w:rPr>
+          <w:rStyle w:val="VerbatimChar"/>
+        </w:rPr>
+        <w:t xml:space="preserve">1. </w:t>
+      </w:r>
+      <w:r>
+        <w:rPr>
+          <w:rStyle w:val="VerbatimChar"/>
+          <w:rFonts w:hint="eastAsia"/>
+        </w:rPr>
+        <w:t xml:space="preserve">购物车功能问题：</w:t>
+      </w:r>
+      <w:r>
+        <w:br/>
+      </w:r>
+      <w:r>
+        <w:br/>
+      </w:r>
+      <w:r>
+        <w:rPr>
+          <w:rStyle w:val="VerbatimChar"/>
+        </w:rPr>
+        <w:t xml:space="preserve">- </w:t>
+      </w:r>
+      <w:r>
+        <w:rPr>
+          <w:rStyle w:val="VerbatimChar"/>
+          <w:rFonts w:hint="eastAsia"/>
+        </w:rPr>
+        <w:t xml:space="preserve">点击商品图片或标题时，没有正确跳转到商品详情页，而是直接跳转到了一个固定的商品页面</w:t>
+      </w:r>
+      <w:r>
+        <w:br/>
+      </w:r>
+      <w:r>
+        <w:br/>
+      </w:r>
+      <w:r>
+        <w:rPr>
+          <w:rStyle w:val="VerbatimChar"/>
+        </w:rPr>
+        <w:t xml:space="preserve">- </w:t>
+      </w:r>
+      <w:r>
+        <w:rPr>
+          <w:rStyle w:val="VerbatimChar"/>
+          <w:rFonts w:hint="eastAsia"/>
+        </w:rPr>
+        <w:t xml:space="preserve">这影响了用户浏览和选择商品的体验</w:t>
+      </w:r>
+      <w:r>
+        <w:br/>
+      </w:r>
+      <w:r>
+        <w:br/>
+      </w:r>
+      <w:r>
+        <w:rPr>
+          <w:rStyle w:val="VerbatimChar"/>
+        </w:rPr>
+        <w:t xml:space="preserve">1. </w:t>
+      </w:r>
+      <w:r>
+        <w:rPr>
+          <w:rStyle w:val="VerbatimChar"/>
+          <w:rFonts w:hint="eastAsia"/>
+        </w:rPr>
+        <w:t xml:space="preserve">排序功能问题：</w:t>
+      </w:r>
+      <w:r>
+        <w:br/>
+      </w:r>
+      <w:r>
+        <w:br/>
+      </w:r>
+      <w:r>
+        <w:rPr>
+          <w:rStyle w:val="VerbatimChar"/>
+        </w:rPr>
+        <w:t xml:space="preserve">- </w:t>
+      </w:r>
+      <w:r>
+        <w:rPr>
+          <w:rStyle w:val="VerbatimChar"/>
+          <w:rFonts w:hint="eastAsia"/>
+        </w:rPr>
+        <w:t xml:space="preserve">选择不同的排序选项（如按价格从低到高）后，商品列表顺序没有发生变化</w:t>
+      </w:r>
+      <w:r>
+        <w:br/>
+      </w:r>
+      <w:r>
+        <w:br/>
+      </w:r>
+      <w:r>
+        <w:rPr>
+          <w:rStyle w:val="VerbatimChar"/>
+        </w:rPr>
+        <w:t xml:space="preserve">- </w:t>
+      </w:r>
+      <w:r>
+        <w:rPr>
+          <w:rStyle w:val="VerbatimChar"/>
+          <w:rFonts w:hint="eastAsia"/>
+        </w:rPr>
+        <w:t xml:space="preserve">排序功能完全失效</w:t>
+      </w:r>
+      <w:r>
+        <w:br/>
+      </w:r>
+      <w:r>
+        <w:br/>
+      </w:r>
+      <w:r>
+        <w:rPr>
+          <w:rStyle w:val="VerbatimChar"/>
+        </w:rPr>
+        <w:t xml:space="preserve">1. </w:t>
+      </w:r>
+      <w:r>
+        <w:rPr>
+          <w:rStyle w:val="VerbatimChar"/>
+          <w:rFonts w:hint="eastAsia"/>
+        </w:rPr>
+        <w:t xml:space="preserve">导航问题：</w:t>
+      </w:r>
+      <w:r>
+        <w:br/>
+      </w:r>
+      <w:r>
+        <w:br/>
+      </w:r>
+      <w:r>
+        <w:rPr>
+          <w:rStyle w:val="VerbatimChar"/>
+        </w:rPr>
+        <w:t xml:space="preserve">- </w:t>
+      </w:r>
+      <w:r>
+        <w:rPr>
+          <w:rStyle w:val="VerbatimChar"/>
+          <w:rFonts w:hint="eastAsia"/>
+        </w:rPr>
+        <w:t xml:space="preserve">点击商品时总是跳转到同一个商品页面，而不是所点击的具体商品</w:t>
+      </w:r>
+      <w:r>
+        <w:br/>
+      </w:r>
+      <w:r>
+        <w:br/>
+      </w:r>
+      <w:r>
+        <w:rPr>
+          <w:rStyle w:val="VerbatimChar"/>
+        </w:rPr>
+        <w:t xml:space="preserve">- </w:t>
+      </w:r>
+      <w:r>
+        <w:rPr>
+          <w:rStyle w:val="VerbatimChar"/>
+          <w:rFonts w:hint="eastAsia"/>
+        </w:rPr>
+        <w:t xml:space="preserve">这严重影响了用户的购物体验</w:t>
+      </w:r>
+      <w:r>
+        <w:br/>
+      </w:r>
+      <w:r>
+        <w:br/>
+      </w:r>
+      <w:r>
+        <w:rPr>
+          <w:rStyle w:val="VerbatimChar"/>
+        </w:rPr>
+        <w:t xml:space="preserve">1. </w:t>
+      </w:r>
+      <w:r>
+        <w:rPr>
+          <w:rStyle w:val="VerbatimChar"/>
+          <w:rFonts w:hint="eastAsia"/>
+        </w:rPr>
+        <w:t xml:space="preserve">按钮状态问题：</w:t>
+      </w:r>
+      <w:r>
+        <w:br/>
+      </w:r>
+      <w:r>
+        <w:br/>
+      </w:r>
+      <w:r>
+        <w:rPr>
+          <w:rStyle w:val="VerbatimChar"/>
+        </w:rPr>
+        <w:t xml:space="preserve">- </w:t>
+      </w:r>
+      <w:r>
+        <w:rPr>
+          <w:rStyle w:val="VerbatimChar"/>
+          <w:rFonts w:hint="eastAsia"/>
+        </w:rPr>
+        <w:t xml:space="preserve">某些商品的"Add</w:t>
+      </w:r>
+      <w:r>
+        <w:rPr>
+          <w:rStyle w:val="VerbatimChar"/>
+        </w:rPr>
+        <w:t xml:space="preserve"> to </w:t>
+      </w:r>
+      <w:r>
+        <w:rPr>
+          <w:rStyle w:val="VerbatimChar"/>
+          <w:rFonts w:hint="eastAsia"/>
+        </w:rPr>
+        <w:t xml:space="preserve">cart"和"Remove"按钮状态显示不一致</w:t>
+      </w:r>
+      <w:r>
+        <w:br/>
+      </w:r>
+      <w:r>
+        <w:br/>
+      </w:r>
+      <w:r>
+        <w:rPr>
+          <w:rStyle w:val="VerbatimChar"/>
+        </w:rPr>
+        <w:t xml:space="preserve">- </w:t>
+      </w:r>
+      <w:r>
+        <w:rPr>
+          <w:rStyle w:val="VerbatimChar"/>
+          <w:rFonts w:hint="eastAsia"/>
+        </w:rPr>
+        <w:t xml:space="preserve">这可能导致用户对购物车中的商品状态产生混淆</w:t>
+      </w:r>
+      <w:r>
+        <w:br/>
+      </w:r>
+      <w:r>
+        <w:br/>
+      </w:r>
+      <w:r>
+        <w:rPr>
+          <w:rStyle w:val="VerbatimChar"/>
+          <w:rFonts w:hint="eastAsia"/>
+        </w:rPr>
+        <w:t xml:space="preserve">这些问题严重影响了网站的基本功能和用户体验。problem_user</w:t>
+      </w:r>
+      <w:r>
+        <w:rPr>
+          <w:rStyle w:val="VerbatimChar"/>
+        </w:rPr>
+        <w:t xml:space="preserve"> </w:t>
+      </w:r>
+      <w:r>
+        <w:rPr>
+          <w:rStyle w:val="VerbatimChar"/>
+          <w:rFonts w:hint="eastAsia"/>
+        </w:rPr>
+        <w:t xml:space="preserve">账号确实展示了多个需要修复的问题，这些问题涵盖了UI显示、功能操作和用户体验等多个方面。</w:t>
+      </w:r>
+      <w:r>
+        <w:br/>
+      </w:r>
+      <w:r>
+        <w:br/>
+      </w:r>
+      <w:r>
+        <w:rPr>
+          <w:rStyle w:val="VerbatimChar"/>
+          <w:rFonts w:hint="eastAsia"/>
+        </w:rPr>
+        <w:t xml:space="preserve">是否需要我继续测试其他功能，比如结账流程？</w:t>
+      </w:r>
+      <w:r>
+        <w:br/>
+      </w:r>
+      <w:r>
+        <w:br/>
+      </w:r>
+      <w:r>
+        <w:rPr>
+          <w:rStyle w:val="VerbatimChar"/>
+          <w:rFonts w:hint="eastAsia"/>
+        </w:rPr>
+        <w:t xml:space="preserve">请继续测试</w:t>
+      </w:r>
+      <w:r>
+        <w:br/>
+      </w:r>
+      <w:r>
+        <w:br/>
+      </w:r>
+      <w:r>
+        <w:rPr>
+          <w:rStyle w:val="VerbatimChar"/>
+          <w:rFonts w:hint="eastAsia"/>
+        </w:rPr>
+        <w:t xml:space="preserve">好的，我将继续测试结账流程。首先让我们添加一些商品到购物车，然后进行结账：</w:t>
+      </w:r>
+      <w:r>
+        <w:br/>
+      </w:r>
+      <w:r>
+        <w:br/>
+      </w:r>
+      <w:r>
+        <w:rPr>
+          <w:rStyle w:val="VerbatimChar"/>
+        </w:rPr>
+        <w:t xml:space="preserve">Called MCP toolbrowser_click</w:t>
+      </w:r>
+      <w:r>
+        <w:br/>
+      </w:r>
+      <w:r>
+        <w:br/>
+      </w:r>
+      <w:r>
+        <w:rPr>
+          <w:rStyle w:val="VerbatimChar"/>
+          <w:rFonts w:hint="eastAsia"/>
+        </w:rPr>
+        <w:t xml:space="preserve">现在让我们点击购物车图标进入购物车页面：</w:t>
+      </w:r>
+      <w:r>
+        <w:br/>
+      </w:r>
+      <w:r>
+        <w:br/>
+      </w:r>
+      <w:r>
+        <w:rPr>
+          <w:rStyle w:val="VerbatimChar"/>
+        </w:rPr>
+        <w:t xml:space="preserve">Called MCP toolbrowser_click</w:t>
+      </w:r>
+      <w:r>
+        <w:br/>
+      </w:r>
+      <w:r>
+        <w:br/>
+      </w:r>
+      <w:r>
+        <w:rPr>
+          <w:rStyle w:val="VerbatimChar"/>
+          <w:rFonts w:hint="eastAsia"/>
+        </w:rPr>
+        <w:t xml:space="preserve">我发现点击购物车图标又出现了一个问题</w:t>
+      </w:r>
+      <w:r>
+        <w:rPr>
+          <w:rStyle w:val="VerbatimChar"/>
+        </w:rPr>
+        <w:t xml:space="preserve"> - </w:t>
+      </w:r>
+      <w:r>
+        <w:rPr>
+          <w:rStyle w:val="VerbatimChar"/>
+          <w:rFonts w:hint="eastAsia"/>
+        </w:rPr>
+        <w:t xml:space="preserve">它把我们带到了商品详情页而不是购物车页面。让我们尝试点击页面右上角的购物车图标：</w:t>
+      </w:r>
+      <w:r>
+        <w:br/>
+      </w:r>
+      <w:r>
+        <w:br/>
+      </w:r>
+      <w:r>
+        <w:rPr>
+          <w:rStyle w:val="VerbatimChar"/>
+        </w:rPr>
+        <w:t xml:space="preserve">Called MCP toolbrowser_navigate</w:t>
+      </w:r>
+      <w:r>
+        <w:br/>
+      </w:r>
+      <w:r>
+        <w:br/>
+      </w:r>
+      <w:r>
+        <w:rPr>
+          <w:rStyle w:val="VerbatimChar"/>
+          <w:rFonts w:hint="eastAsia"/>
+        </w:rPr>
+        <w:t xml:space="preserve">让我们继续结账流程，点击Checkout按钮：</w:t>
+      </w:r>
+      <w:r>
+        <w:br/>
+      </w:r>
+      <w:r>
+        <w:br/>
+      </w:r>
+      <w:r>
+        <w:rPr>
+          <w:rStyle w:val="VerbatimChar"/>
+        </w:rPr>
+        <w:t xml:space="preserve">Called MCP toolbrowser_click</w:t>
+      </w:r>
+      <w:r>
+        <w:br/>
+      </w:r>
+      <w:r>
+        <w:br/>
+      </w:r>
+      <w:r>
+        <w:rPr>
+          <w:rStyle w:val="VerbatimChar"/>
+          <w:rFonts w:hint="eastAsia"/>
+        </w:rPr>
+        <w:t xml:space="preserve">让我们填写个人信息：</w:t>
+      </w:r>
+      <w:r>
+        <w:br/>
+      </w:r>
+      <w:r>
+        <w:br/>
+      </w:r>
+      <w:r>
+        <w:rPr>
+          <w:rStyle w:val="VerbatimChar"/>
+        </w:rPr>
+        <w:t xml:space="preserve">Called MCP toolbrowser_type</w:t>
+      </w:r>
+      <w:r>
+        <w:br/>
+      </w:r>
+      <w:r>
+        <w:br/>
+      </w:r>
+      <w:r>
+        <w:rPr>
+          <w:rStyle w:val="VerbatimChar"/>
+        </w:rPr>
+        <w:t xml:space="preserve">Called MCP toolbrowser_type</w:t>
+      </w:r>
+      <w:r>
+        <w:br/>
+      </w:r>
+      <w:r>
+        <w:br/>
+      </w:r>
+      <w:r>
+        <w:rPr>
+          <w:rStyle w:val="VerbatimChar"/>
+        </w:rPr>
+        <w:t xml:space="preserve">Called MCP toolbrowser_type</w:t>
+      </w:r>
+      <w:r>
+        <w:br/>
+      </w:r>
+      <w:r>
+        <w:br/>
+      </w:r>
+      <w:r>
+        <w:rPr>
+          <w:rStyle w:val="VerbatimChar"/>
+          <w:rFonts w:hint="eastAsia"/>
+        </w:rPr>
+        <w:t xml:space="preserve">点击Continue继续：</w:t>
+      </w:r>
+      <w:r>
+        <w:br/>
+      </w:r>
+      <w:r>
+        <w:br/>
+      </w:r>
+      <w:r>
+        <w:rPr>
+          <w:rStyle w:val="VerbatimChar"/>
+        </w:rPr>
+        <w:t xml:space="preserve">Called MCP toolbrowser_click</w:t>
+      </w:r>
+      <w:r>
+        <w:br/>
+      </w:r>
+      <w:r>
+        <w:br/>
+      </w:r>
+      <w:r>
+        <w:rPr>
+          <w:rStyle w:val="VerbatimChar"/>
+          <w:rFonts w:hint="eastAsia"/>
+        </w:rPr>
+        <w:t xml:space="preserve">我发现了一个新的问题：虽然我们输入了姓氏，但系统显示"Last</w:t>
+      </w:r>
+      <w:r>
+        <w:rPr>
+          <w:rStyle w:val="VerbatimChar"/>
+        </w:rPr>
+        <w:t xml:space="preserve"> Name is </w:t>
+      </w:r>
+      <w:r>
+        <w:rPr>
+          <w:rStyle w:val="VerbatimChar"/>
+          <w:rFonts w:hint="eastAsia"/>
+        </w:rPr>
+        <w:t xml:space="preserve">required"的错误。这说明在输入字段上存在问题。让我们再次尝试输入姓氏：</w:t>
+      </w:r>
+      <w:r>
+        <w:br/>
+      </w:r>
+      <w:r>
+        <w:br/>
+      </w:r>
+      <w:r>
+        <w:rPr>
+          <w:rStyle w:val="VerbatimChar"/>
+        </w:rPr>
+        <w:t xml:space="preserve">Called MCP toolbrowser_type</w:t>
+      </w:r>
+      <w:r>
+        <w:br/>
+      </w:r>
+      <w:r>
+        <w:br/>
+      </w:r>
+      <w:r>
+        <w:rPr>
+          <w:rStyle w:val="VerbatimChar"/>
+          <w:rFonts w:hint="eastAsia"/>
+        </w:rPr>
+        <w:t xml:space="preserve">基于测试过程，我发现了以下新的问题：</w:t>
+      </w:r>
+      <w:r>
+        <w:br/>
+      </w:r>
+      <w:r>
+        <w:br/>
+      </w:r>
+      <w:r>
+        <w:rPr>
+          <w:rStyle w:val="VerbatimChar"/>
+        </w:rPr>
+        <w:t xml:space="preserve">1. </w:t>
+      </w:r>
+      <w:r>
+        <w:rPr>
+          <w:rStyle w:val="VerbatimChar"/>
+          <w:rFonts w:hint="eastAsia"/>
+        </w:rPr>
+        <w:t xml:space="preserve">购物车导航问题：</w:t>
+      </w:r>
+      <w:r>
+        <w:br/>
+      </w:r>
+      <w:r>
+        <w:br/>
+      </w:r>
+      <w:r>
+        <w:rPr>
+          <w:rStyle w:val="VerbatimChar"/>
+        </w:rPr>
+        <w:t xml:space="preserve">- </w:t>
+      </w:r>
+      <w:r>
+        <w:rPr>
+          <w:rStyle w:val="VerbatimChar"/>
+          <w:rFonts w:hint="eastAsia"/>
+        </w:rPr>
+        <w:t xml:space="preserve">点击商品列表页面的购物车图标会错误地导航到商品详情页</w:t>
+      </w:r>
+      <w:r>
+        <w:br/>
+      </w:r>
+      <w:r>
+        <w:br/>
+      </w:r>
+      <w:r>
+        <w:rPr>
+          <w:rStyle w:val="VerbatimChar"/>
+        </w:rPr>
+        <w:t xml:space="preserve">- </w:t>
+      </w:r>
+      <w:r>
+        <w:rPr>
+          <w:rStyle w:val="VerbatimChar"/>
+          <w:rFonts w:hint="eastAsia"/>
+        </w:rPr>
+        <w:t xml:space="preserve">必须手动输入购物车URL才能访问购物车页面</w:t>
+      </w:r>
+      <w:r>
+        <w:br/>
+      </w:r>
+      <w:r>
+        <w:br/>
+      </w:r>
+      <w:r>
+        <w:rPr>
+          <w:rStyle w:val="VerbatimChar"/>
+        </w:rPr>
+        <w:t xml:space="preserve">1. </w:t>
+      </w:r>
+      <w:r>
+        <w:rPr>
+          <w:rStyle w:val="VerbatimChar"/>
+          <w:rFonts w:hint="eastAsia"/>
+        </w:rPr>
+        <w:t xml:space="preserve">结账表单问题：</w:t>
+      </w:r>
+      <w:r>
+        <w:br/>
+      </w:r>
+      <w:r>
+        <w:br/>
+      </w:r>
+      <w:r>
+        <w:rPr>
+          <w:rStyle w:val="VerbatimChar"/>
+        </w:rPr>
+        <w:t xml:space="preserve">- </w:t>
+      </w:r>
+      <w:r>
+        <w:rPr>
+          <w:rStyle w:val="VerbatimChar"/>
+          <w:rFonts w:hint="eastAsia"/>
+        </w:rPr>
+        <w:t xml:space="preserve">姓氏（Last</w:t>
+      </w:r>
+      <w:r>
+        <w:rPr>
+          <w:rStyle w:val="VerbatimChar"/>
+        </w:rPr>
+        <w:t xml:space="preserve"> </w:t>
+      </w:r>
+      <w:r>
+        <w:rPr>
+          <w:rStyle w:val="VerbatimChar"/>
+          <w:rFonts w:hint="eastAsia"/>
+        </w:rPr>
+        <w:t xml:space="preserve">Name）输入框存在严重问题</w:t>
+      </w:r>
+      <w:r>
+        <w:br/>
+      </w:r>
+      <w:r>
+        <w:br/>
+      </w:r>
+      <w:r>
+        <w:rPr>
+          <w:rStyle w:val="VerbatimChar"/>
+        </w:rPr>
+        <w:t xml:space="preserve">- </w:t>
+      </w:r>
+      <w:r>
+        <w:rPr>
+          <w:rStyle w:val="VerbatimChar"/>
+          <w:rFonts w:hint="eastAsia"/>
+        </w:rPr>
+        <w:t xml:space="preserve">即使输入了姓氏，系统仍然显示"Last</w:t>
+      </w:r>
+      <w:r>
+        <w:rPr>
+          <w:rStyle w:val="VerbatimChar"/>
+        </w:rPr>
+        <w:t xml:space="preserve"> Name is </w:t>
+      </w:r>
+      <w:r>
+        <w:rPr>
+          <w:rStyle w:val="VerbatimChar"/>
+          <w:rFonts w:hint="eastAsia"/>
+        </w:rPr>
+        <w:t xml:space="preserve">required"错误</w:t>
+      </w:r>
+      <w:r>
+        <w:br/>
+      </w:r>
+      <w:r>
+        <w:br/>
+      </w:r>
+      <w:r>
+        <w:rPr>
+          <w:rStyle w:val="VerbatimChar"/>
+        </w:rPr>
+        <w:t xml:space="preserve">- </w:t>
+      </w:r>
+      <w:r>
+        <w:rPr>
+          <w:rStyle w:val="VerbatimChar"/>
+          <w:rFonts w:hint="eastAsia"/>
+        </w:rPr>
+        <w:t xml:space="preserve">这个问题阻止了用户完成结账流程</w:t>
+      </w:r>
+      <w:r>
+        <w:br/>
+      </w:r>
+      <w:r>
+        <w:br/>
+      </w:r>
+      <w:r>
+        <w:rPr>
+          <w:rStyle w:val="VerbatimChar"/>
+        </w:rPr>
+        <w:t xml:space="preserve">1. </w:t>
+      </w:r>
+      <w:r>
+        <w:rPr>
+          <w:rStyle w:val="VerbatimChar"/>
+          <w:rFonts w:hint="eastAsia"/>
+        </w:rPr>
+        <w:t xml:space="preserve">购物车商品显示问题：</w:t>
+      </w:r>
+      <w:r>
+        <w:br/>
+      </w:r>
+      <w:r>
+        <w:br/>
+      </w:r>
+      <w:r>
+        <w:rPr>
+          <w:rStyle w:val="VerbatimChar"/>
+        </w:rPr>
+        <w:t xml:space="preserve">- </w:t>
+      </w:r>
+      <w:r>
+        <w:rPr>
+          <w:rStyle w:val="VerbatimChar"/>
+          <w:rFonts w:hint="eastAsia"/>
+        </w:rPr>
+        <w:t xml:space="preserve">购物车中显示的商品数量与实际添加的商品数量不一致</w:t>
+      </w:r>
+      <w:r>
+        <w:br/>
+      </w:r>
+      <w:r>
+        <w:br/>
+      </w:r>
+      <w:r>
+        <w:rPr>
+          <w:rStyle w:val="VerbatimChar"/>
+        </w:rPr>
+        <w:t xml:space="preserve">- </w:t>
+      </w:r>
+      <w:r>
+        <w:rPr>
+          <w:rStyle w:val="VerbatimChar"/>
+          <w:rFonts w:hint="eastAsia"/>
+        </w:rPr>
+        <w:t xml:space="preserve">一些未添加的商品也出现在购物车中</w:t>
+      </w:r>
+      <w:r>
+        <w:br/>
+      </w:r>
+      <w:r>
+        <w:br/>
+      </w:r>
+      <w:r>
+        <w:rPr>
+          <w:rStyle w:val="VerbatimChar"/>
+          <w:rFonts w:hint="eastAsia"/>
+        </w:rPr>
+        <w:t xml:space="preserve">这些问题与之前发现的问题一起，严重影响了整个购物流程：</w:t>
+      </w:r>
+      <w:r>
+        <w:br/>
+      </w:r>
+      <w:r>
+        <w:br/>
+      </w:r>
+      <w:r>
+        <w:rPr>
+          <w:rStyle w:val="VerbatimChar"/>
+        </w:rPr>
+        <w:t xml:space="preserve">- </w:t>
+      </w:r>
+      <w:r>
+        <w:rPr>
+          <w:rStyle w:val="VerbatimChar"/>
+          <w:rFonts w:hint="eastAsia"/>
+        </w:rPr>
+        <w:t xml:space="preserve">用户无法正常浏览商品（图片问题）</w:t>
+      </w:r>
+      <w:r>
+        <w:br/>
+      </w:r>
+      <w:r>
+        <w:br/>
+      </w:r>
+      <w:r>
+        <w:rPr>
+          <w:rStyle w:val="VerbatimChar"/>
+        </w:rPr>
+        <w:t xml:space="preserve">- </w:t>
+      </w:r>
+      <w:r>
+        <w:rPr>
+          <w:rStyle w:val="VerbatimChar"/>
+          <w:rFonts w:hint="eastAsia"/>
+        </w:rPr>
+        <w:t xml:space="preserve">无法正确添加商品到购物车（购物车功能问题）</w:t>
+      </w:r>
+      <w:r>
+        <w:br/>
+      </w:r>
+      <w:r>
+        <w:br/>
+      </w:r>
+      <w:r>
+        <w:rPr>
+          <w:rStyle w:val="VerbatimChar"/>
+        </w:rPr>
+        <w:t xml:space="preserve">- </w:t>
+      </w:r>
+      <w:r>
+        <w:rPr>
+          <w:rStyle w:val="VerbatimChar"/>
+          <w:rFonts w:hint="eastAsia"/>
+        </w:rPr>
+        <w:t xml:space="preserve">无法使用排序功能（排序失效）</w:t>
+      </w:r>
+      <w:r>
+        <w:br/>
+      </w:r>
+      <w:r>
+        <w:br/>
+      </w:r>
+      <w:r>
+        <w:rPr>
+          <w:rStyle w:val="VerbatimChar"/>
+        </w:rPr>
+        <w:t xml:space="preserve">- </w:t>
+      </w:r>
+      <w:r>
+        <w:rPr>
+          <w:rStyle w:val="VerbatimChar"/>
+          <w:rFonts w:hint="eastAsia"/>
+        </w:rPr>
+        <w:t xml:space="preserve">无法正常访问购物车（导航问题）</w:t>
+      </w:r>
+      <w:r>
+        <w:br/>
+      </w:r>
+      <w:r>
+        <w:br/>
+      </w:r>
+      <w:r>
+        <w:rPr>
+          <w:rStyle w:val="VerbatimChar"/>
+        </w:rPr>
+        <w:t xml:space="preserve">- </w:t>
+      </w:r>
+      <w:r>
+        <w:rPr>
+          <w:rStyle w:val="VerbatimChar"/>
+          <w:rFonts w:hint="eastAsia"/>
+        </w:rPr>
+        <w:t xml:space="preserve">无法完成结账流程（表单验证问题）</w:t>
+      </w:r>
+      <w:r>
+        <w:br/>
+      </w:r>
+      <w:r>
+        <w:br/>
+      </w:r>
+      <w:r>
+        <w:rPr>
+          <w:rStyle w:val="VerbatimChar"/>
+          <w:rFonts w:hint="eastAsia"/>
+        </w:rPr>
+        <w:t xml:space="preserve">这些问题使得</w:t>
+      </w:r>
+      <w:r>
+        <w:rPr>
+          <w:rStyle w:val="VerbatimChar"/>
+        </w:rPr>
+        <w:t xml:space="preserve"> problem_user </w:t>
+      </w:r>
+      <w:r>
+        <w:rPr>
+          <w:rStyle w:val="VerbatimChar"/>
+          <w:rFonts w:hint="eastAsia"/>
+        </w:rPr>
+        <w:t xml:space="preserve">账号几乎无法完成正常的购物流程。每个主要功能都存在不同程度的问题，这可能是为了测试目的而特意设置的。</w:t>
+      </w:r>
+      <w:r>
+        <w:br/>
+      </w:r>
+      <w:r>
+        <w:br/>
+      </w:r>
+      <w:r>
+        <w:rPr>
+          <w:rStyle w:val="VerbatimChar"/>
+          <w:rFonts w:hint="eastAsia"/>
+        </w:rPr>
+        <w:t xml:space="preserve">是否需要我继续测试其他功能，比如菜单栏的功能？</w:t>
+      </w:r>
+      <w:r>
+        <w:br/>
+      </w:r>
+      <w:r>
+        <w:br/>
+      </w:r>
+      <w:r>
+        <w:rPr>
+          <w:rStyle w:val="VerbatimChar"/>
+          <w:rFonts w:hint="eastAsia"/>
+        </w:rPr>
+        <w:t xml:space="preserve">完成测试，请退出登录并汇总发现的问题</w:t>
+      </w:r>
+      <w:r>
+        <w:br/>
+      </w:r>
+      <w:r>
+        <w:br/>
+      </w:r>
+      <w:r>
+        <w:rPr>
+          <w:rStyle w:val="VerbatimChar"/>
+          <w:rFonts w:hint="eastAsia"/>
+        </w:rPr>
+        <w:t xml:space="preserve">好的，让我们先点击菜单按钮然后退出登录：</w:t>
+      </w:r>
+      <w:r>
+        <w:br/>
+      </w:r>
+      <w:r>
+        <w:br/>
+      </w:r>
+      <w:r>
+        <w:rPr>
+          <w:rStyle w:val="VerbatimChar"/>
+        </w:rPr>
+        <w:t xml:space="preserve">Called MCP toolbrowser_click</w:t>
+      </w:r>
+      <w:r>
+        <w:br/>
+      </w:r>
+      <w:r>
+        <w:br/>
+      </w:r>
+      <w:r>
+        <w:rPr>
+          <w:rStyle w:val="VerbatimChar"/>
+        </w:rPr>
+        <w:t xml:space="preserve">Called MCP toolbrowser_click</w:t>
+      </w:r>
+      <w:r>
+        <w:br/>
+      </w:r>
+      <w:r>
+        <w:br/>
+      </w:r>
+      <w:r>
+        <w:rPr>
+          <w:rStyle w:val="VerbatimChar"/>
+          <w:rFonts w:hint="eastAsia"/>
+        </w:rPr>
+        <w:t xml:space="preserve">现在我来汇总使用</w:t>
+      </w:r>
+      <w:r>
+        <w:rPr>
+          <w:rStyle w:val="VerbatimChar"/>
+        </w:rPr>
+        <w:t xml:space="preserve"> problem_user </w:t>
+      </w:r>
+      <w:r>
+        <w:rPr>
+          <w:rStyle w:val="VerbatimChar"/>
+          <w:rFonts w:hint="eastAsia"/>
+        </w:rPr>
+        <w:t xml:space="preserve">账号测试发现的所有问题：</w:t>
+      </w:r>
+      <w:r>
+        <w:br/>
+      </w:r>
+      <w:r>
+        <w:br/>
+      </w:r>
+      <w:r>
+        <w:rPr>
+          <w:rStyle w:val="VerbatimChar"/>
+        </w:rPr>
+        <w:t xml:space="preserve">### 1. </w:t>
+      </w:r>
+      <w:r>
+        <w:rPr>
+          <w:rStyle w:val="VerbatimChar"/>
+          <w:rFonts w:hint="eastAsia"/>
+        </w:rPr>
+        <w:t xml:space="preserve">商品展示问题</w:t>
+      </w:r>
+      <w:r>
+        <w:br/>
+      </w:r>
+      <w:r>
+        <w:br/>
+      </w:r>
+      <w:r>
+        <w:rPr>
+          <w:rStyle w:val="VerbatimChar"/>
+        </w:rPr>
+        <w:t xml:space="preserve">- </w:t>
+      </w:r>
+      <w:r>
+        <w:rPr>
+          <w:rStyle w:val="VerbatimChar"/>
+          <w:rFonts w:hint="eastAsia"/>
+        </w:rPr>
+        <w:t xml:space="preserve">所有商品图片显示为相同的狗图片，而不是各自的产品图片</w:t>
+      </w:r>
+      <w:r>
+        <w:br/>
+      </w:r>
+      <w:r>
+        <w:br/>
+      </w:r>
+      <w:r>
+        <w:rPr>
+          <w:rStyle w:val="VerbatimChar"/>
+        </w:rPr>
+        <w:t xml:space="preserve">- </w:t>
+      </w:r>
+      <w:r>
+        <w:rPr>
+          <w:rStyle w:val="VerbatimChar"/>
+          <w:rFonts w:hint="eastAsia"/>
+        </w:rPr>
+        <w:t xml:space="preserve">这严重影响了用户对产品的视觉识别和购物体验</w:t>
+      </w:r>
+      <w:r>
+        <w:br/>
+      </w:r>
+      <w:r>
+        <w:br/>
+      </w:r>
+      <w:r>
+        <w:rPr>
+          <w:rStyle w:val="VerbatimChar"/>
+        </w:rPr>
+        <w:t xml:space="preserve">### 2. </w:t>
+      </w:r>
+      <w:r>
+        <w:rPr>
+          <w:rStyle w:val="VerbatimChar"/>
+          <w:rFonts w:hint="eastAsia"/>
+        </w:rPr>
+        <w:t xml:space="preserve">导航问题</w:t>
+      </w:r>
+      <w:r>
+        <w:br/>
+      </w:r>
+      <w:r>
+        <w:br/>
+      </w:r>
+      <w:r>
+        <w:rPr>
+          <w:rStyle w:val="VerbatimChar"/>
+        </w:rPr>
+        <w:t xml:space="preserve">- </w:t>
+      </w:r>
+      <w:r>
+        <w:rPr>
+          <w:rStyle w:val="VerbatimChar"/>
+          <w:rFonts w:hint="eastAsia"/>
+        </w:rPr>
+        <w:t xml:space="preserve">点击商品图片或标题时，总是跳转到固定的商品页面，而不是所点击的具体商品</w:t>
+      </w:r>
+      <w:r>
+        <w:br/>
+      </w:r>
+      <w:r>
+        <w:br/>
+      </w:r>
+      <w:r>
+        <w:rPr>
+          <w:rStyle w:val="VerbatimChar"/>
+        </w:rPr>
+        <w:t xml:space="preserve">- </w:t>
+      </w:r>
+      <w:r>
+        <w:rPr>
+          <w:rStyle w:val="VerbatimChar"/>
+          <w:rFonts w:hint="eastAsia"/>
+        </w:rPr>
+        <w:t xml:space="preserve">点击购物车图标错误地导航到商品详情页，而不是购物车页面</w:t>
+      </w:r>
+      <w:r>
+        <w:br/>
+      </w:r>
+      <w:r>
+        <w:br/>
+      </w:r>
+      <w:r>
+        <w:rPr>
+          <w:rStyle w:val="VerbatimChar"/>
+        </w:rPr>
+        <w:t xml:space="preserve">- </w:t>
+      </w:r>
+      <w:r>
+        <w:rPr>
+          <w:rStyle w:val="VerbatimChar"/>
+          <w:rFonts w:hint="eastAsia"/>
+        </w:rPr>
+        <w:t xml:space="preserve">必须手动输入购物车URL才能正确访问购物车页面</w:t>
+      </w:r>
+      <w:r>
+        <w:br/>
+      </w:r>
+      <w:r>
+        <w:br/>
+      </w:r>
+      <w:r>
+        <w:rPr>
+          <w:rStyle w:val="VerbatimChar"/>
+        </w:rPr>
+        <w:t xml:space="preserve">### 3. </w:t>
+      </w:r>
+      <w:r>
+        <w:rPr>
+          <w:rStyle w:val="VerbatimChar"/>
+          <w:rFonts w:hint="eastAsia"/>
+        </w:rPr>
+        <w:t xml:space="preserve">商品排序功能问题</w:t>
+      </w:r>
+      <w:r>
+        <w:br/>
+      </w:r>
+      <w:r>
+        <w:br/>
+      </w:r>
+      <w:r>
+        <w:rPr>
+          <w:rStyle w:val="VerbatimChar"/>
+        </w:rPr>
+        <w:t xml:space="preserve">- </w:t>
+      </w:r>
+      <w:r>
+        <w:rPr>
+          <w:rStyle w:val="VerbatimChar"/>
+          <w:rFonts w:hint="eastAsia"/>
+        </w:rPr>
+        <w:t xml:space="preserve">选择不同的排序选项（如按价格从低到高）后，商品列表顺序没有任何变化</w:t>
+      </w:r>
+      <w:r>
+        <w:br/>
+      </w:r>
+      <w:r>
+        <w:br/>
+      </w:r>
+      <w:r>
+        <w:rPr>
+          <w:rStyle w:val="VerbatimChar"/>
+        </w:rPr>
+        <w:t xml:space="preserve">- </w:t>
+      </w:r>
+      <w:r>
+        <w:rPr>
+          <w:rStyle w:val="VerbatimChar"/>
+          <w:rFonts w:hint="eastAsia"/>
+        </w:rPr>
+        <w:t xml:space="preserve">排序功能完全失效，无法帮助用户按需要的方式浏览商品</w:t>
+      </w:r>
+      <w:r>
+        <w:br/>
+      </w:r>
+      <w:r>
+        <w:br/>
+      </w:r>
+      <w:r>
+        <w:rPr>
+          <w:rStyle w:val="VerbatimChar"/>
+        </w:rPr>
+        <w:t xml:space="preserve">### 4. </w:t>
+      </w:r>
+      <w:r>
+        <w:rPr>
+          <w:rStyle w:val="VerbatimChar"/>
+          <w:rFonts w:hint="eastAsia"/>
+        </w:rPr>
+        <w:t xml:space="preserve">购物车功能问题</w:t>
+      </w:r>
+      <w:r>
+        <w:br/>
+      </w:r>
+      <w:r>
+        <w:br/>
+      </w:r>
+      <w:r>
+        <w:rPr>
+          <w:rStyle w:val="VerbatimChar"/>
+        </w:rPr>
+        <w:t xml:space="preserve">- </w:t>
+      </w:r>
+      <w:r>
+        <w:rPr>
+          <w:rStyle w:val="VerbatimChar"/>
+          <w:rFonts w:hint="eastAsia"/>
+        </w:rPr>
+        <w:t xml:space="preserve">购物车中显示的商品与实际添加的商品不一致</w:t>
+      </w:r>
+      <w:r>
+        <w:br/>
+      </w:r>
+      <w:r>
+        <w:br/>
+      </w:r>
+      <w:r>
+        <w:rPr>
+          <w:rStyle w:val="VerbatimChar"/>
+        </w:rPr>
+        <w:t xml:space="preserve">- </w:t>
+      </w:r>
+      <w:r>
+        <w:rPr>
+          <w:rStyle w:val="VerbatimChar"/>
+          <w:rFonts w:hint="eastAsia"/>
+        </w:rPr>
+        <w:t xml:space="preserve">一些未添加的商品也出现在购物车中</w:t>
+      </w:r>
+      <w:r>
+        <w:br/>
+      </w:r>
+      <w:r>
+        <w:br/>
+      </w:r>
+      <w:r>
+        <w:rPr>
+          <w:rStyle w:val="VerbatimChar"/>
+        </w:rPr>
+        <w:t xml:space="preserve">- "Add to </w:t>
+      </w:r>
+      <w:r>
+        <w:rPr>
+          <w:rStyle w:val="VerbatimChar"/>
+          <w:rFonts w:hint="eastAsia"/>
+        </w:rPr>
+        <w:t xml:space="preserve">cart"和"Remove"按钮状态显示不一致，造成用户混淆</w:t>
+      </w:r>
+      <w:r>
+        <w:br/>
+      </w:r>
+      <w:r>
+        <w:br/>
+      </w:r>
+      <w:r>
+        <w:rPr>
+          <w:rStyle w:val="VerbatimChar"/>
+        </w:rPr>
+        <w:t xml:space="preserve">### 5. </w:t>
+      </w:r>
+      <w:r>
+        <w:rPr>
+          <w:rStyle w:val="VerbatimChar"/>
+          <w:rFonts w:hint="eastAsia"/>
+        </w:rPr>
+        <w:t xml:space="preserve">结账流程问题</w:t>
+      </w:r>
+      <w:r>
+        <w:br/>
+      </w:r>
+      <w:r>
+        <w:br/>
+      </w:r>
+      <w:r>
+        <w:rPr>
+          <w:rStyle w:val="VerbatimChar"/>
+        </w:rPr>
+        <w:t xml:space="preserve">- </w:t>
+      </w:r>
+      <w:r>
+        <w:rPr>
+          <w:rStyle w:val="VerbatimChar"/>
+          <w:rFonts w:hint="eastAsia"/>
+        </w:rPr>
+        <w:t xml:space="preserve">姓氏（Last</w:t>
+      </w:r>
+      <w:r>
+        <w:rPr>
+          <w:rStyle w:val="VerbatimChar"/>
+        </w:rPr>
+        <w:t xml:space="preserve"> </w:t>
+      </w:r>
+      <w:r>
+        <w:rPr>
+          <w:rStyle w:val="VerbatimChar"/>
+          <w:rFonts w:hint="eastAsia"/>
+        </w:rPr>
+        <w:t xml:space="preserve">Name）输入框存在严重问题</w:t>
+      </w:r>
+      <w:r>
+        <w:br/>
+      </w:r>
+      <w:r>
+        <w:br/>
+      </w:r>
+      <w:r>
+        <w:rPr>
+          <w:rStyle w:val="VerbatimChar"/>
+        </w:rPr>
+        <w:t xml:space="preserve">- </w:t>
+      </w:r>
+      <w:r>
+        <w:rPr>
+          <w:rStyle w:val="VerbatimChar"/>
+          <w:rFonts w:hint="eastAsia"/>
+        </w:rPr>
+        <w:t xml:space="preserve">即使输入了姓氏，系统仍然显示"Last</w:t>
+      </w:r>
+      <w:r>
+        <w:rPr>
+          <w:rStyle w:val="VerbatimChar"/>
+        </w:rPr>
+        <w:t xml:space="preserve"> Name is </w:t>
+      </w:r>
+      <w:r>
+        <w:rPr>
+          <w:rStyle w:val="VerbatimChar"/>
+          <w:rFonts w:hint="eastAsia"/>
+        </w:rPr>
+        <w:t xml:space="preserve">required"错误</w:t>
+      </w:r>
+      <w:r>
+        <w:br/>
+      </w:r>
+      <w:r>
+        <w:br/>
+      </w:r>
+      <w:r>
+        <w:rPr>
+          <w:rStyle w:val="VerbatimChar"/>
+        </w:rPr>
+        <w:t xml:space="preserve">- </w:t>
+      </w:r>
+      <w:r>
+        <w:rPr>
+          <w:rStyle w:val="VerbatimChar"/>
+          <w:rFonts w:hint="eastAsia"/>
+        </w:rPr>
+        <w:t xml:space="preserve">这个验证问题完全阻止了用户完成结账流程</w:t>
+      </w:r>
+      <w:r>
+        <w:br/>
+      </w:r>
+      <w:r>
+        <w:br/>
+      </w:r>
+      <w:r>
+        <w:rPr>
+          <w:rStyle w:val="VerbatimChar"/>
+        </w:rPr>
+        <w:t xml:space="preserve">### 6. </w:t>
+      </w:r>
+      <w:r>
+        <w:rPr>
+          <w:rStyle w:val="VerbatimChar"/>
+          <w:rFonts w:hint="eastAsia"/>
+        </w:rPr>
+        <w:t xml:space="preserve">用户体验影响</w:t>
+      </w:r>
+      <w:r>
+        <w:br/>
+      </w:r>
+      <w:r>
+        <w:br/>
+      </w:r>
+      <w:r>
+        <w:rPr>
+          <w:rStyle w:val="VerbatimChar"/>
+        </w:rPr>
+        <w:t xml:space="preserve">- </w:t>
+      </w:r>
+      <w:r>
+        <w:rPr>
+          <w:rStyle w:val="VerbatimChar"/>
+          <w:rFonts w:hint="eastAsia"/>
+        </w:rPr>
+        <w:t xml:space="preserve">以上问题的综合效果导致：</w:t>
+      </w:r>
+      <w:r>
+        <w:br/>
+      </w:r>
+      <w:r>
+        <w:br/>
+      </w:r>
+      <w:r>
+        <w:rPr>
+          <w:rStyle w:val="VerbatimChar"/>
+        </w:rPr>
+        <w:t xml:space="preserve">- </w:t>
+      </w:r>
+      <w:r>
+        <w:rPr>
+          <w:rStyle w:val="VerbatimChar"/>
+          <w:rFonts w:hint="eastAsia"/>
+        </w:rPr>
+        <w:t xml:space="preserve">用户无法正确浏览和选择商品</w:t>
+      </w:r>
+      <w:r>
+        <w:br/>
+      </w:r>
+      <w:r>
+        <w:br/>
+      </w:r>
+      <w:r>
+        <w:rPr>
+          <w:rStyle w:val="VerbatimChar"/>
+        </w:rPr>
+        <w:t xml:space="preserve">- </w:t>
+      </w:r>
+      <w:r>
+        <w:rPr>
+          <w:rStyle w:val="VerbatimChar"/>
+          <w:rFonts w:hint="eastAsia"/>
+        </w:rPr>
+        <w:t xml:space="preserve">无法管理购物车内容</w:t>
+      </w:r>
+      <w:r>
+        <w:br/>
+      </w:r>
+      <w:r>
+        <w:br/>
+      </w:r>
+      <w:r>
+        <w:rPr>
+          <w:rStyle w:val="VerbatimChar"/>
+        </w:rPr>
+        <w:t xml:space="preserve">- </w:t>
+      </w:r>
+      <w:r>
+        <w:rPr>
+          <w:rStyle w:val="VerbatimChar"/>
+          <w:rFonts w:hint="eastAsia"/>
+        </w:rPr>
+        <w:t xml:space="preserve">无法完成购物流程</w:t>
+      </w:r>
+      <w:r>
+        <w:br/>
+      </w:r>
+      <w:r>
+        <w:br/>
+      </w:r>
+      <w:r>
+        <w:rPr>
+          <w:rStyle w:val="VerbatimChar"/>
+        </w:rPr>
+        <w:t xml:space="preserve">- </w:t>
+      </w:r>
+      <w:r>
+        <w:rPr>
+          <w:rStyle w:val="VerbatimChar"/>
+          <w:rFonts w:hint="eastAsia"/>
+        </w:rPr>
+        <w:t xml:space="preserve">整体购物体验严重受损</w:t>
+      </w:r>
+      <w:r>
+        <w:br/>
+      </w:r>
+      <w:r>
+        <w:br/>
+      </w:r>
+      <w:r>
+        <w:rPr>
+          <w:rStyle w:val="VerbatimChar"/>
+        </w:rPr>
+        <w:t xml:space="preserve">### 7. </w:t>
+      </w:r>
+      <w:r>
+        <w:rPr>
+          <w:rStyle w:val="VerbatimChar"/>
+          <w:rFonts w:hint="eastAsia"/>
+        </w:rPr>
+        <w:t xml:space="preserve">功能可用性评估</w:t>
+      </w:r>
+      <w:r>
+        <w:br/>
+      </w:r>
+      <w:r>
+        <w:br/>
+      </w:r>
+      <w:r>
+        <w:rPr>
+          <w:rStyle w:val="VerbatimChar"/>
+        </w:rPr>
+        <w:t xml:space="preserve">- </w:t>
+      </w:r>
+      <w:r>
+        <w:rPr>
+          <w:rStyle w:val="VerbatimChar"/>
+          <w:rFonts w:hint="eastAsia"/>
+        </w:rPr>
+        <w:t xml:space="preserve">基本功能几乎都存在问题</w:t>
+      </w:r>
+      <w:r>
+        <w:br/>
+      </w:r>
+      <w:r>
+        <w:br/>
+      </w:r>
+      <w:r>
+        <w:rPr>
+          <w:rStyle w:val="VerbatimChar"/>
+        </w:rPr>
+        <w:t xml:space="preserve">- </w:t>
+      </w:r>
+      <w:r>
+        <w:rPr>
+          <w:rStyle w:val="VerbatimChar"/>
+          <w:rFonts w:hint="eastAsia"/>
+        </w:rPr>
+        <w:t xml:space="preserve">用户无法完成正常的购物流程</w:t>
+      </w:r>
+      <w:r>
+        <w:br/>
+      </w:r>
+      <w:r>
+        <w:br/>
+      </w:r>
+      <w:r>
+        <w:rPr>
+          <w:rStyle w:val="VerbatimChar"/>
+        </w:rPr>
+        <w:t xml:space="preserve">- </w:t>
+      </w:r>
+      <w:r>
+        <w:rPr>
+          <w:rStyle w:val="VerbatimChar"/>
+          <w:rFonts w:hint="eastAsia"/>
+        </w:rPr>
+        <w:t xml:space="preserve">这个账号可能是专门用于测试目的，展示了各种可能的问题场景</w:t>
+      </w:r>
+      <w:r>
+        <w:br/>
+      </w:r>
+      <w:r>
+        <w:br/>
+      </w:r>
+      <w:r>
+        <w:rPr>
+          <w:rStyle w:val="VerbatimChar"/>
+          <w:rFonts w:hint="eastAsia"/>
+        </w:rPr>
+        <w:t xml:space="preserve">这些问题涵盖了电子商务网站的核心功能，包括商品展示、导航、购物车管理和结账流程。每个环节都存在不同程度的问题，使得整个购物体验变得极其困难和令人沮丧。这些问题的存在可能是为了测试目的，帮助开发人员和测试人员理解各种可能的错误场景。</w:t>
+      </w:r>
+    </w:p>
+    <w:p>
+      <w:pPr>
+        <w:pStyle w:val="FirstParagraph"/>
+      </w:pPr>
+      <w:r>
+        <w:rPr>
+          <w:rFonts w:hint="eastAsia"/>
+        </w:rPr>
+        <w:t xml:space="preserve">可以看到，通过</w:t>
+      </w:r>
+      <w:r>
+        <w:t xml:space="preserve"> Cursor + Playwright-mcp </w:t>
+      </w:r>
+      <w:r>
+        <w:rPr>
+          <w:rFonts w:hint="eastAsia"/>
+        </w:rPr>
+        <w:t xml:space="preserve">，AI</w:t>
+      </w:r>
+      <w:r>
+        <w:t xml:space="preserve"> </w:t>
+      </w:r>
+      <w:r>
+        <w:rPr>
+          <w:rFonts w:hint="eastAsia"/>
+        </w:rPr>
+        <w:t xml:space="preserve">已经可以通过我们交代的基本指令，主动帮助我们去覆盖主要的功能测试场景并发现和记录问题。假以时日，完全可以很大程度上替代掉比较基础功能测试任务，而测试人员则可以更关注在高价值的深度问题挖掘上。当然，另一方面，基础功能测试人员，确实也要有相当的危机意识，技能提升和扩展边界刻不容缓。</w:t>
+      </w:r>
+    </w:p>
+    <w:p>
+      <w:pPr>
+        <w:pStyle w:val="BodyText"/>
+      </w:pPr>
+      <w:r>
+        <w:drawing>
+          <wp:inline>
+            <wp:extent cx="3276600" cy="3276600"/>
+            <wp:effectExtent b="0" l="0" r="0" t="0"/>
+            <wp:docPr descr="" title="" id="61" name="Picture"/>
+            <a:graphic>
+              <a:graphicData uri="http://schemas.openxmlformats.org/drawingml/2006/picture">
+                <pic:pic>
+                  <pic:nvPicPr>
+                    <pic:cNvPr descr="qrcode_for_gh_e12c318badb4_258%20(1).jpg" id="62" name="Picture"/>
+                    <pic:cNvPicPr>
+                      <a:picLocks noChangeArrowheads="1" noChangeAspect="1"/>
+                    </pic:cNvPicPr>
+                  </pic:nvPicPr>
+                  <pic:blipFill>
+                    <a:blip r:embed="rId60"/>
+                    <a:stretch>
+                      <a:fillRect/>
+                    </a:stretch>
+                  </pic:blipFill>
+                  <pic:spPr bwMode="auto">
+                    <a:xfrm>
+                      <a:off x="0" y="0"/>
+                      <a:ext cx="3276600" cy="3276600"/>
+                    </a:xfrm>
+                    <a:prstGeom prst="rect">
+                      <a:avLst/>
+                    </a:prstGeom>
+                    <a:noFill/>
+                    <a:ln w="9525">
+                      <a:noFill/>
+                      <a:headEnd/>
+                      <a:tailEnd/>
+                    </a:ln>
+                  </pic:spPr>
+                </pic:pic>
+              </a:graphicData>
+            </a:graphic>
+          </wp:inline>
+        </w:drawing>
+      </w:r>
+    </w:p>
+    <w:p>
+      <w:pPr>
+        <w:pStyle w:val="BodyText"/>
+      </w:pPr>
+      <w:r>
+        <w:rPr>
+          <w:rFonts w:hint="eastAsia"/>
+        </w:rPr>
+        <w:t xml:space="preserve">欢迎关注秋草的测试技能体系化进阶提升课程，公众号回复</w:t>
+      </w:r>
+      <w:r>
+        <w:t xml:space="preserve"> </w:t>
+      </w:r>
+      <w:r>
+        <w:rPr>
+          <w:rStyle w:val="VerbatimChar"/>
+          <w:rFonts w:hint="eastAsia"/>
+        </w:rPr>
+        <w:t xml:space="preserve">大纲</w:t>
+      </w:r>
+      <w:r>
+        <w:t xml:space="preserve"> </w:t>
+      </w:r>
+      <w:r>
+        <w:rPr>
+          <w:rFonts w:hint="eastAsia"/>
+        </w:rPr>
+        <w:t xml:space="preserve">了解课程详细目录</w:t>
+      </w:r>
+    </w:p>
+    <w:bookmarkEnd w:id="63"/>
+    <w:bookmarkEnd w:id="64"/>
     <w:sectPr/>
   </w:body>
 </w:document>

</xml_diff>